<commit_message>
legal: update price list with exact 29.06.2026 date and test tariffs (free, 300 rub, 1000 rub)
</commit_message>
<xml_diff>
--- a/baza/исходник миникурса/ПРАЙС_ЛИСТ_УСЛУГ_И_ПРОДУКТОВ_ФЕДОРОВ.docx
+++ b/baza/исходник миникурса/ПРАЙС_ЛИСТ_УСЛУГ_И_ПРОДУКТОВ_ФЕДОРОВ.docx
@@ -31,7 +31,7 @@
         </w:rPr>
         <w:t>Исполнитель: Федоров Анатолий Игоревич (ИНН 164803784216, плательщик НПД)</w:t>
         <w:br/>
-        <w:t>Действует с «30» августа 2026 г.</w:t>
+        <w:t>Дата публикации: «29» июня 2026 г.</w:t>
       </w:r>
     </w:p>
     <w:p>
@@ -45,7 +45,7 @@
           <w:color w:val="1F4E5B"/>
           <w:sz w:val="26"/>
         </w:rPr>
-        <w:t>1. ИНДИВИДУАЛЬНАЯ РАБОТА И КОНСУЛЬТАЦИИ</w:t>
+        <w:t>1. ПРОХОЖДЕНИЕ ТЕСТА И АНАЛИТИЧЕСКИЕ ОТЧЕТЫ</w:t>
       </w:r>
     </w:p>
     <w:p>
@@ -59,7 +59,7 @@
           <w:color w:val="111111"/>
           <w:sz w:val="22"/>
         </w:rPr>
-        <w:t xml:space="preserve">• Индивидуальная психологическая сессия / Диагностика — </w:t>
+        <w:t xml:space="preserve">• Бесплатный вариант теста — </w:t>
       </w:r>
       <w:r>
         <w:rPr>
@@ -68,7 +68,7 @@
           <w:color w:val="0E6E5D"/>
           <w:sz w:val="23"/>
         </w:rPr>
-        <w:t>10 000 ₽</w:t>
+        <w:t>0 ₽ (Бесплатно)</w:t>
       </w:r>
       <w:r>
         <w:rPr>
@@ -77,7 +77,7 @@
           <w:color w:val="666666"/>
           <w:sz w:val="20"/>
         </w:rPr>
-        <w:t xml:space="preserve"> (онлайн, 60–80 минут)</w:t>
+        <w:t xml:space="preserve"> (онлайн-формат)</w:t>
       </w:r>
     </w:p>
     <w:p>
@@ -91,7 +91,7 @@
           <w:color w:val="444444"/>
           <w:sz w:val="20"/>
         </w:rPr>
-        <w:t>Глубокий разбор ситуации, определение системного корня проблемы (в отношениях, личном состоянии или сценарии жизни), гипнотерапевтическая коррекция и составление персонального пошагового плана решений.</w:t>
+        <w:t>Краткий ознакомительный отчет с учетом двух ключевых пунктов и первичными рекомендациями (объем 2–3 страницы в электронном виде).</w:t>
       </w:r>
     </w:p>
     <w:p>
@@ -105,7 +105,7 @@
           <w:color w:val="111111"/>
           <w:sz w:val="22"/>
         </w:rPr>
-        <w:t xml:space="preserve">• Пакет из 3-х индивидуальных сессий (Комплексная трансформация) — </w:t>
+        <w:t xml:space="preserve">• Индивидуальный анализ — </w:t>
       </w:r>
       <w:r>
         <w:rPr>
@@ -114,7 +114,7 @@
           <w:color w:val="0E6E5D"/>
           <w:sz w:val="23"/>
         </w:rPr>
-        <w:t>27 000 ₽</w:t>
+        <w:t>300 ₽</w:t>
       </w:r>
       <w:r>
         <w:rPr>
@@ -123,7 +123,7 @@
           <w:color w:val="666666"/>
           <w:sz w:val="20"/>
         </w:rPr>
-        <w:t xml:space="preserve"> (онлайн, 3 сессии по 60–80 мин)</w:t>
+        <w:t xml:space="preserve"> (PDF-файл)</w:t>
       </w:r>
     </w:p>
     <w:p>
@@ -137,7 +137,53 @@
           <w:color w:val="444444"/>
           <w:sz w:val="20"/>
         </w:rPr>
-        <w:t>Полный цикл глубокой проработки запроса: диагностика ➔ глубинная гипнотерапия и перепрошивка сценария ➔ закрепление новых поведенческих реакций и защита от откатов.</w:t>
+        <w:t>Полный автоматизированный анализ с генерацией персонального PDF-документа, включающего все 14 диагностических пунктов, подробное описание сценариев и практические рекомендации (объем от 18 до 25 страниц).</w:t>
+      </w:r>
+    </w:p>
+    <w:p>
+      <w:pPr>
+        <w:spacing w:before="120" w:after="20"/>
+      </w:pPr>
+      <w:r>
+        <w:rPr>
+          <w:rFonts w:ascii="Calibri" w:hAnsi="Calibri"/>
+          <w:b/>
+          <w:color w:val="111111"/>
+          <w:sz w:val="22"/>
+        </w:rPr>
+        <w:t xml:space="preserve">• Парный анализ отношений — </w:t>
+      </w:r>
+      <w:r>
+        <w:rPr>
+          <w:rFonts w:ascii="Calibri" w:hAnsi="Calibri"/>
+          <w:b/>
+          <w:color w:val="0E6E5D"/>
+          <w:sz w:val="23"/>
+        </w:rPr>
+        <w:t>1 000 ₽</w:t>
+      </w:r>
+      <w:r>
+        <w:rPr>
+          <w:rFonts w:ascii="Calibri" w:hAnsi="Calibri"/>
+          <w:i/>
+          <w:color w:val="666666"/>
+          <w:sz w:val="20"/>
+        </w:rPr>
+        <w:t xml:space="preserve"> (PDF-файл)</w:t>
+      </w:r>
+    </w:p>
+    <w:p>
+      <w:pPr>
+        <w:spacing w:after="100"/>
+        <w:ind w:left="360"/>
+      </w:pPr>
+      <w:r>
+        <w:rPr>
+          <w:rFonts w:ascii="Calibri" w:hAnsi="Calibri"/>
+          <w:color w:val="444444"/>
+          <w:sz w:val="20"/>
+        </w:rPr>
+        <w:t>Комплексный анализ пары: включает в себя два полноценных индивидуальных анализа партнеров + сравнительный парный анализ совместимости и точек напряжения (общий объем до 60 страниц).</w:t>
       </w:r>
     </w:p>
     <w:p>
@@ -197,7 +243,7 @@
           <w:color w:val="444444"/>
           <w:sz w:val="20"/>
         </w:rPr>
-        <w:t>5 видеоуроков, 3 гипнотические аудиопрактики («Штиль в теле», «Амнистия обид», «Союз двух свободных»), интерактивные тренажеры Готтмана + Пакет из 4 бонусов (выход из бойкота, неловкость в спальне, границы с родственниками, разделение быта) + Карта семейной опоры.</w:t>
+        <w:t>5 видеоуроков, 3 гипнотические аудиопрактики («Штиль в теле», «Амнистия обид», «Союз двух свободных»), интерактивные тренажеры + Пакет из 4 бонусов + Карта семейной опоры.</w:t>
       </w:r>
     </w:p>
     <w:p>
@@ -243,7 +289,7 @@
           <w:color w:val="444444"/>
           <w:sz w:val="20"/>
         </w:rPr>
-        <w:t>5 видеоуроков и соматических практик для остановки мысленной жвачки, выхода из созависимости, тревоги от пауз партнера и обретения железобетонной опоры на себя.</w:t>
+        <w:t>5 видеоуроков и соматических практик для остановки мысленной жвачки, тревоги от пауз и обретения устойчивой опоры на себя.</w:t>
       </w:r>
     </w:p>
     <w:p>
@@ -289,7 +335,7 @@
           <w:color w:val="444444"/>
           <w:sz w:val="20"/>
         </w:rPr>
-        <w:t>Пошаговая программа выхода из повторяющегося сценария выбора холодных и недоступных партнеров («эмоциональные качели»), интеграция тени и построение надежного союза.</w:t>
+        <w:t>Пошаговая программа выхода из повторяющегося сценария выбора холодных партнеров и эмоциональных качелей.</w:t>
       </w:r>
     </w:p>
     <w:p>
@@ -303,7 +349,7 @@
           <w:color w:val="1F4E5B"/>
           <w:sz w:val="26"/>
         </w:rPr>
-        <w:t>3. МЕДИТАЦИИ И АУДИОПРАКТИКИ (АВТОРСКИЙ АУДИОФОНД)</w:t>
+        <w:t>3. МЕДИТАЦИИ И АУДИОПРАКТИКИ</w:t>
       </w:r>
     </w:p>
     <w:p>
@@ -335,7 +381,7 @@
           <w:color w:val="666666"/>
           <w:sz w:val="20"/>
         </w:rPr>
-        <w:t xml:space="preserve"> (аудиофайл в личный кабинет)</w:t>
+        <w:t xml:space="preserve"> (аудиофайл)</w:t>
       </w:r>
     </w:p>
     <w:p>
@@ -349,7 +395,7 @@
           <w:color w:val="444444"/>
           <w:sz w:val="20"/>
         </w:rPr>
-        <w:t>12-минутная соматическая аудиосессия на снятие мышечных зажимов с шеи, диафрагмы и челюстей, снижение уровня вечернего кортизола и восстановление сна.</w:t>
+        <w:t>12-минутная соматическая аудиосессия на снятие мышечных зажимов с шеи и челюстей, снижение кортизола и восстановление сна.</w:t>
       </w:r>
     </w:p>
     <w:p>
@@ -381,7 +427,7 @@
           <w:color w:val="666666"/>
           <w:sz w:val="20"/>
         </w:rPr>
-        <w:t xml:space="preserve"> (аудиофайл в личный кабинет)</w:t>
+        <w:t xml:space="preserve"> (аудиофайл)</w:t>
       </w:r>
     </w:p>
     <w:p>
@@ -395,7 +441,21 @@
           <w:color w:val="444444"/>
           <w:sz w:val="20"/>
         </w:rPr>
-        <w:t>11-минутная гипнотическая сессия на освобождение от накопившегося груза прошлых обид и претензий к партнеру.</w:t>
+        <w:t>11-минутная сессия на освобождение от груза прошлых обид и претензий к партнеру.</w:t>
+      </w:r>
+    </w:p>
+    <w:p>
+      <w:pPr>
+        <w:spacing w:before="280" w:after="80"/>
+      </w:pPr>
+      <w:r>
+        <w:rPr>
+          <w:rFonts w:ascii="Calibri" w:hAnsi="Calibri"/>
+          <w:b/>
+          <w:color w:val="1F4E5B"/>
+          <w:sz w:val="26"/>
+        </w:rPr>
+        <w:t>4. ИНДИВИДУАЛЬНАЯ РАБОТА И КОНСУЛЬТАЦИИ</w:t>
       </w:r>
     </w:p>
     <w:p>
@@ -409,7 +469,7 @@
           <w:color w:val="111111"/>
           <w:sz w:val="22"/>
         </w:rPr>
-        <w:t xml:space="preserve">• Полный сборник авторских аудиопрактик Анатолия Фёдорова (5 треков) — </w:t>
+        <w:t xml:space="preserve">• Индивидуальная психологическая сессия / Диагностика — </w:t>
       </w:r>
       <w:r>
         <w:rPr>
@@ -418,7 +478,7 @@
           <w:color w:val="0E6E5D"/>
           <w:sz w:val="23"/>
         </w:rPr>
-        <w:t>2 900 ₽</w:t>
+        <w:t>10 000 ₽</w:t>
       </w:r>
       <w:r>
         <w:rPr>
@@ -427,7 +487,7 @@
           <w:color w:val="666666"/>
           <w:sz w:val="20"/>
         </w:rPr>
-        <w:t xml:space="preserve"> (бессрочный доступ)</w:t>
+        <w:t xml:space="preserve"> (онлайн, 60–80 минут)</w:t>
       </w:r>
     </w:p>
     <w:p>
@@ -441,21 +501,7 @@
           <w:color w:val="444444"/>
           <w:sz w:val="20"/>
         </w:rPr>
-        <w:t>Комплект соматических и гипнотерапевтических аудиосессий для ежедневной саморегуляции, восстановления спокойствия и устойчивости.</w:t>
-      </w:r>
-    </w:p>
-    <w:p>
-      <w:pPr>
-        <w:spacing w:before="280" w:after="80"/>
-      </w:pPr>
-      <w:r>
-        <w:rPr>
-          <w:rFonts w:ascii="Calibri" w:hAnsi="Calibri"/>
-          <w:b/>
-          <w:color w:val="1F4E5B"/>
-          <w:sz w:val="26"/>
-        </w:rPr>
-        <w:t>4. ЭКСПРЕСС-ДИАГНОСТИКА И ЦИФРОВЫЕ ОТЧЕТЫ</w:t>
+        <w:t>Глубокий разбор ситуации, определение системного корня проблемы, гипнотерапевтическая коррекция и персональный план решений с Анатолием Фёдоровым.</w:t>
       </w:r>
     </w:p>
     <w:p>
@@ -469,7 +515,7 @@
           <w:color w:val="111111"/>
           <w:sz w:val="22"/>
         </w:rPr>
-        <w:t xml:space="preserve">• Экспресс-тест «Где сбой в отношениях?» (Псиквест) — </w:t>
+        <w:t xml:space="preserve">• Пакет из 3-х индивидуальных сессий — </w:t>
       </w:r>
       <w:r>
         <w:rPr>
@@ -478,7 +524,7 @@
           <w:color w:val="0E6E5D"/>
           <w:sz w:val="23"/>
         </w:rPr>
-        <w:t>0 ₽ (Бесплатно)</w:t>
+        <w:t>27 000 ₽</w:t>
       </w:r>
       <w:r>
         <w:rPr>
@@ -487,7 +533,7 @@
           <w:color w:val="666666"/>
           <w:sz w:val="20"/>
         </w:rPr>
-        <w:t xml:space="preserve"> (в Telegram-боте)</w:t>
+        <w:t xml:space="preserve"> (онлайн, 3 сессии)</w:t>
       </w:r>
     </w:p>
     <w:p>
@@ -501,53 +547,7 @@
           <w:color w:val="444444"/>
           <w:sz w:val="20"/>
         </w:rPr>
-        <w:t>2-минутный интерактивный опрос с определением ведущего семейного сценария и вводной практикой.</w:t>
-      </w:r>
-    </w:p>
-    <w:p>
-      <w:pPr>
-        <w:spacing w:before="120" w:after="20"/>
-      </w:pPr>
-      <w:r>
-        <w:rPr>
-          <w:rFonts w:ascii="Calibri" w:hAnsi="Calibri"/>
-          <w:b/>
-          <w:color w:val="111111"/>
-          <w:sz w:val="22"/>
-        </w:rPr>
-        <w:t xml:space="preserve">• Персональный аналитический PDF-отчет отношений — </w:t>
-      </w:r>
-      <w:r>
-        <w:rPr>
-          <w:rFonts w:ascii="Calibri" w:hAnsi="Calibri"/>
-          <w:b/>
-          <w:color w:val="0E6E5D"/>
-          <w:sz w:val="23"/>
-        </w:rPr>
-        <w:t>1 490 ₽</w:t>
-      </w:r>
-      <w:r>
-        <w:rPr>
-          <w:rFonts w:ascii="Calibri" w:hAnsi="Calibri"/>
-          <w:i/>
-          <w:color w:val="666666"/>
-          <w:sz w:val="20"/>
-        </w:rPr>
-        <w:t xml:space="preserve"> (PDF-файл в бот)</w:t>
-      </w:r>
-    </w:p>
-    <w:p>
-      <w:pPr>
-        <w:spacing w:after="100"/>
-        <w:ind w:left="360"/>
-      </w:pPr>
-      <w:r>
-        <w:rPr>
-          <w:rFonts w:ascii="Calibri" w:hAnsi="Calibri"/>
-          <w:color w:val="444444"/>
-          <w:sz w:val="20"/>
-        </w:rPr>
-        <w:t>Автоматизированный детальный разбор поведенческих паттернов вашей пары с персональными рекомендациями на 15+ страниц.</w:t>
+        <w:t>Полный цикл глубокой проработки запроса: диагностика ➔ гипнотерапия и перепрошивка сценария ➔ закрепление новых реакций и защита от откатов.</w:t>
       </w:r>
     </w:p>
     <w:p>
@@ -572,7 +572,7 @@
         </w:rPr>
         <w:t>1. Все цены указаны в российских рублях. НДС не облагается в связи с применением специального налогового режима НПД (самозанятый, Федеральный закон № 422-ФЗ).</w:t>
         <w:br/>
-        <w:t>2. Оплата производится на условиях 100% предоплаты в безналичном порядке через уполномоченные платежные сервисы.</w:t>
+        <w:t>2. Оплата производится на условиях 100% предоплаты в безналичном порядке через уполномоченные платежные сервисы (Robokassa и др.).</w:t>
         <w:br/>
         <w:t>3. Услуги профессионального образования в Академии МАГиГ оформляются отдельными договорами через Академию.</w:t>
       </w:r>

</xml_diff>

<commit_message>
legal: finalize comprehensive master price list covering all 5 product tiers (tests, 4 courses, audio, sessions, webinars)
</commit_message>
<xml_diff>
--- a/baza/исходник миникурса/ПРАЙС_ЛИСТ_УСЛУГ_И_ПРОДУКТОВ_ФЕДОРОВ.docx
+++ b/baza/исходник миникурса/ПРАЙС_ЛИСТ_УСЛУГ_И_ПРОДУКТОВ_ФЕДОРОВ.docx
@@ -12,9 +12,9 @@
           <w:rFonts w:ascii="Calibri" w:hAnsi="Calibri"/>
           <w:b/>
           <w:color w:val="1F4E5B"/>
-          <w:sz w:val="36"/>
+          <w:sz w:val="34"/>
         </w:rPr>
-        <w:t>ПРАЙС-ЛИСТ УСЛУГ И ЦИФРОВЫХ ПРОДУКТОВ</w:t>
+        <w:t>ЕДИНЫЙ ОФИЦИАЛЬНЫЙ ПРАЙС-ЛИСТ</w:t>
       </w:r>
     </w:p>
     <w:p>
@@ -27,7 +27,7 @@
           <w:rFonts w:ascii="Calibri" w:hAnsi="Calibri"/>
           <w:i/>
           <w:color w:val="555555"/>
-          <w:sz w:val="22"/>
+          <w:sz w:val="21"/>
         </w:rPr>
         <w:t>Исполнитель: Федоров Анатолий Игоревич (ИНН 164803784216, плательщик НПД)</w:t>
         <w:br/>
@@ -36,28 +36,28 @@
     </w:p>
     <w:p>
       <w:pPr>
-        <w:spacing w:before="280" w:after="80"/>
+        <w:spacing w:before="240" w:after="60"/>
       </w:pPr>
       <w:r>
         <w:rPr>
           <w:rFonts w:ascii="Calibri" w:hAnsi="Calibri"/>
           <w:b/>
           <w:color w:val="1F4E5B"/>
-          <w:sz w:val="26"/>
+          <w:sz w:val="24"/>
         </w:rPr>
-        <w:t>1. ПРОХОЖДЕНИЕ ТЕСТА И АНАЛИТИЧЕСКИЕ ОТЧЕТЫ</w:t>
+        <w:t>1. ПРОХОЖДЕНИЕ ТЕСТА И АНАЛИТИЧЕСКИЕ ОТЧЕТЫ (ПСИКВЕСТ)</w:t>
       </w:r>
     </w:p>
     <w:p>
       <w:pPr>
-        <w:spacing w:before="120" w:after="20"/>
+        <w:spacing w:before="100" w:after="20"/>
       </w:pPr>
       <w:r>
         <w:rPr>
           <w:rFonts w:ascii="Calibri" w:hAnsi="Calibri"/>
           <w:b/>
           <w:color w:val="111111"/>
-          <w:sz w:val="22"/>
+          <w:sz w:val="21"/>
         </w:rPr>
         <w:t xml:space="preserve">• Бесплатный вариант теста — </w:t>
       </w:r>
@@ -66,7 +66,7 @@
           <w:rFonts w:ascii="Calibri" w:hAnsi="Calibri"/>
           <w:b/>
           <w:color w:val="0E6E5D"/>
-          <w:sz w:val="23"/>
+          <w:sz w:val="22"/>
         </w:rPr>
         <w:t>0 ₽ (Бесплатно)</w:t>
       </w:r>
@@ -75,35 +75,35 @@
           <w:rFonts w:ascii="Calibri" w:hAnsi="Calibri"/>
           <w:i/>
           <w:color w:val="666666"/>
-          <w:sz w:val="20"/>
+          <w:sz w:val="19"/>
         </w:rPr>
-        <w:t xml:space="preserve"> (онлайн-формат)</w:t>
+        <w:t xml:space="preserve"> (в Telegram-боте)</w:t>
       </w:r>
     </w:p>
     <w:p>
       <w:pPr>
-        <w:spacing w:after="100"/>
+        <w:spacing w:after="80"/>
         <w:ind w:left="360"/>
       </w:pPr>
       <w:r>
         <w:rPr>
           <w:rFonts w:ascii="Calibri" w:hAnsi="Calibri"/>
           <w:color w:val="444444"/>
-          <w:sz w:val="20"/>
+          <w:sz w:val="19"/>
         </w:rPr>
-        <w:t>Краткий ознакомительный отчет с учетом двух ключевых пунктов и первичными рекомендациями (объем 2–3 страницы в электронном виде).</w:t>
+        <w:t>Краткий отчет, учитывающий два пункта для ознакомления (объем 2–3 страницы в электронном виде).</w:t>
       </w:r>
     </w:p>
     <w:p>
       <w:pPr>
-        <w:spacing w:before="120" w:after="20"/>
+        <w:spacing w:before="100" w:after="20"/>
       </w:pPr>
       <w:r>
         <w:rPr>
           <w:rFonts w:ascii="Calibri" w:hAnsi="Calibri"/>
           <w:b/>
           <w:color w:val="111111"/>
-          <w:sz w:val="22"/>
+          <w:sz w:val="21"/>
         </w:rPr>
         <w:t xml:space="preserve">• Индивидуальный анализ — </w:t>
       </w:r>
@@ -112,7 +112,7 @@
           <w:rFonts w:ascii="Calibri" w:hAnsi="Calibri"/>
           <w:b/>
           <w:color w:val="0E6E5D"/>
-          <w:sz w:val="23"/>
+          <w:sz w:val="22"/>
         </w:rPr>
         <w:t>300 ₽</w:t>
       </w:r>
@@ -121,35 +121,35 @@
           <w:rFonts w:ascii="Calibri" w:hAnsi="Calibri"/>
           <w:i/>
           <w:color w:val="666666"/>
-          <w:sz w:val="20"/>
+          <w:sz w:val="19"/>
         </w:rPr>
         <w:t xml:space="preserve"> (PDF-файл)</w:t>
       </w:r>
     </w:p>
     <w:p>
       <w:pPr>
-        <w:spacing w:after="100"/>
+        <w:spacing w:after="80"/>
         <w:ind w:left="360"/>
       </w:pPr>
       <w:r>
         <w:rPr>
           <w:rFonts w:ascii="Calibri" w:hAnsi="Calibri"/>
           <w:color w:val="444444"/>
-          <w:sz w:val="20"/>
+          <w:sz w:val="19"/>
         </w:rPr>
-        <w:t>Полный автоматизированный анализ с генерацией персонального PDF-документа, включающего все 14 диагностических пунктов, подробное описание сценариев и практические рекомендации (объем от 18 до 25 страниц).</w:t>
+        <w:t>Полный автоматизированный анализ с получением PDF-документа, включающий все 14 пунктов (объем от 18 до 25 страниц).</w:t>
       </w:r>
     </w:p>
     <w:p>
       <w:pPr>
-        <w:spacing w:before="120" w:after="20"/>
+        <w:spacing w:before="100" w:after="20"/>
       </w:pPr>
       <w:r>
         <w:rPr>
           <w:rFonts w:ascii="Calibri" w:hAnsi="Calibri"/>
           <w:b/>
           <w:color w:val="111111"/>
-          <w:sz w:val="22"/>
+          <w:sz w:val="21"/>
         </w:rPr>
         <w:t xml:space="preserve">• Парный анализ отношений — </w:t>
       </w:r>
@@ -158,7 +158,7 @@
           <w:rFonts w:ascii="Calibri" w:hAnsi="Calibri"/>
           <w:b/>
           <w:color w:val="0E6E5D"/>
-          <w:sz w:val="23"/>
+          <w:sz w:val="22"/>
         </w:rPr>
         <w:t>1 000 ₽</w:t>
       </w:r>
@@ -167,58 +167,58 @@
           <w:rFonts w:ascii="Calibri" w:hAnsi="Calibri"/>
           <w:i/>
           <w:color w:val="666666"/>
-          <w:sz w:val="20"/>
+          <w:sz w:val="19"/>
         </w:rPr>
         <w:t xml:space="preserve"> (PDF-файл)</w:t>
       </w:r>
     </w:p>
     <w:p>
       <w:pPr>
-        <w:spacing w:after="100"/>
+        <w:spacing w:after="80"/>
         <w:ind w:left="360"/>
       </w:pPr>
       <w:r>
         <w:rPr>
           <w:rFonts w:ascii="Calibri" w:hAnsi="Calibri"/>
           <w:color w:val="444444"/>
-          <w:sz w:val="20"/>
+          <w:sz w:val="19"/>
         </w:rPr>
-        <w:t>Комплексный анализ пары: включает в себя два полноценных индивидуальных анализа партнеров + сравнительный парный анализ совместимости и точек напряжения (общий объем до 60 страниц).</w:t>
+        <w:t>Комплексный анализ пары: включает в себя два индивидуальных анализа партнеров + сравнительный парный анализ (общий объем до 60 страниц).</w:t>
       </w:r>
     </w:p>
     <w:p>
       <w:pPr>
-        <w:spacing w:before="280" w:after="80"/>
+        <w:spacing w:before="240" w:after="60"/>
       </w:pPr>
       <w:r>
         <w:rPr>
           <w:rFonts w:ascii="Calibri" w:hAnsi="Calibri"/>
           <w:b/>
           <w:color w:val="1F4E5B"/>
-          <w:sz w:val="26"/>
+          <w:sz w:val="24"/>
         </w:rPr>
         <w:t>2. ПРАКТИЧЕСКИЕ ОНЛАЙН-КУРСЫ (ПОШАГОВЫЕ ПРОГРАММЫ)</w:t>
       </w:r>
     </w:p>
     <w:p>
       <w:pPr>
-        <w:spacing w:before="120" w:after="20"/>
+        <w:spacing w:before="100" w:after="20"/>
       </w:pPr>
       <w:r>
         <w:rPr>
           <w:rFonts w:ascii="Calibri" w:hAnsi="Calibri"/>
           <w:b/>
           <w:color w:val="111111"/>
-          <w:sz w:val="22"/>
+          <w:sz w:val="21"/>
         </w:rPr>
-        <w:t xml:space="preserve">• Курс «Мы вместе» (Перезагрузка зрелых отношений) — </w:t>
+        <w:t xml:space="preserve">• Курс «Мы вместе» (Сценарий 3: Семья, брак 7–25 лет) — </w:t>
       </w:r>
       <w:r>
         <w:rPr>
           <w:rFonts w:ascii="Calibri" w:hAnsi="Calibri"/>
           <w:b/>
           <w:color w:val="0E6E5D"/>
-          <w:sz w:val="23"/>
+          <w:sz w:val="22"/>
         </w:rPr>
         <w:t>2 400 ₽</w:t>
       </w:r>
@@ -227,44 +227,44 @@
           <w:rFonts w:ascii="Calibri" w:hAnsi="Calibri"/>
           <w:i/>
           <w:color w:val="666666"/>
-          <w:sz w:val="20"/>
+          <w:sz w:val="19"/>
         </w:rPr>
         <w:t xml:space="preserve"> (доступ 6 месяцев)</w:t>
       </w:r>
     </w:p>
     <w:p>
       <w:pPr>
-        <w:spacing w:after="100"/>
+        <w:spacing w:after="80"/>
         <w:ind w:left="360"/>
       </w:pPr>
       <w:r>
         <w:rPr>
           <w:rFonts w:ascii="Calibri" w:hAnsi="Calibri"/>
           <w:color w:val="444444"/>
-          <w:sz w:val="20"/>
+          <w:sz w:val="19"/>
         </w:rPr>
-        <w:t>5 видеоуроков, 3 гипнотические аудиопрактики («Штиль в теле», «Амнистия обид», «Союз двух свободных»), интерактивные тренажеры + Пакет из 4 бонусов + Карта семейной опоры.</w:t>
+        <w:t>5 видеоуроков, 3 гипнотические аудиопрактики («Штиль в теле», «Амнистия обид», «Союз двух свободных»), интерактивные тренажеры Готтмана + Пакет из 4 бонусов (выход из бойкота, неловкость в спальне, границы с родственниками, разделение быта) + Карта семейной опоры. Специальная цена при быстрой оплате (базовая цена — 5 000 ₽).</w:t>
       </w:r>
     </w:p>
     <w:p>
       <w:pPr>
-        <w:spacing w:before="120" w:after="20"/>
+        <w:spacing w:before="100" w:after="20"/>
       </w:pPr>
       <w:r>
         <w:rPr>
           <w:rFonts w:ascii="Calibri" w:hAnsi="Calibri"/>
           <w:b/>
           <w:color w:val="111111"/>
-          <w:sz w:val="22"/>
+          <w:sz w:val="21"/>
         </w:rPr>
-        <w:t xml:space="preserve">• Курс «Я остаюсь собой» (Эмоциональный суверенитет) — </w:t>
+        <w:t xml:space="preserve">• Курс «Я остаюсь собой» (Сценарий 2: Эмоциональный суверенитет и тревога) — </w:t>
       </w:r>
       <w:r>
         <w:rPr>
           <w:rFonts w:ascii="Calibri" w:hAnsi="Calibri"/>
           <w:b/>
           <w:color w:val="0E6E5D"/>
-          <w:sz w:val="23"/>
+          <w:sz w:val="22"/>
         </w:rPr>
         <w:t>2 400 ₽</w:t>
       </w:r>
@@ -273,44 +273,44 @@
           <w:rFonts w:ascii="Calibri" w:hAnsi="Calibri"/>
           <w:i/>
           <w:color w:val="666666"/>
-          <w:sz w:val="20"/>
+          <w:sz w:val="19"/>
         </w:rPr>
         <w:t xml:space="preserve"> (доступ 6 месяцев)</w:t>
       </w:r>
     </w:p>
     <w:p>
       <w:pPr>
-        <w:spacing w:after="100"/>
+        <w:spacing w:after="80"/>
         <w:ind w:left="360"/>
       </w:pPr>
       <w:r>
         <w:rPr>
           <w:rFonts w:ascii="Calibri" w:hAnsi="Calibri"/>
           <w:color w:val="444444"/>
-          <w:sz w:val="20"/>
+          <w:sz w:val="19"/>
         </w:rPr>
-        <w:t>5 видеоуроков и соматических практик для остановки мысленной жвачки, тревоги от пауз и обретения устойчивой опоры на себя.</w:t>
+        <w:t>5 видеоуроков, практики остановки мысленной жвачки, выхода из созависимости, тревоги от пауз и обретения устойчивой опоры на себя (базовая цена — 5 000 ₽).</w:t>
       </w:r>
     </w:p>
     <w:p>
       <w:pPr>
-        <w:spacing w:before="120" w:after="20"/>
+        <w:spacing w:before="100" w:after="20"/>
       </w:pPr>
       <w:r>
         <w:rPr>
           <w:rFonts w:ascii="Calibri" w:hAnsi="Calibri"/>
           <w:b/>
           <w:color w:val="111111"/>
-          <w:sz w:val="22"/>
+          <w:sz w:val="21"/>
         </w:rPr>
-        <w:t xml:space="preserve">• Курс «Я выбираю» (Сценарии выбора партнера) — </w:t>
+        <w:t xml:space="preserve">• Курс «Я выбираю» (Сценарий 1: Выбор партнера и свидания) — </w:t>
       </w:r>
       <w:r>
         <w:rPr>
           <w:rFonts w:ascii="Calibri" w:hAnsi="Calibri"/>
           <w:b/>
           <w:color w:val="0E6E5D"/>
-          <w:sz w:val="23"/>
+          <w:sz w:val="22"/>
         </w:rPr>
         <w:t>2 400 ₽</w:t>
       </w:r>
@@ -319,49 +319,141 @@
           <w:rFonts w:ascii="Calibri" w:hAnsi="Calibri"/>
           <w:i/>
           <w:color w:val="666666"/>
-          <w:sz w:val="20"/>
+          <w:sz w:val="19"/>
         </w:rPr>
         <w:t xml:space="preserve"> (доступ 6 месяцев)</w:t>
       </w:r>
     </w:p>
     <w:p>
       <w:pPr>
-        <w:spacing w:after="100"/>
+        <w:spacing w:after="80"/>
         <w:ind w:left="360"/>
       </w:pPr>
       <w:r>
         <w:rPr>
           <w:rFonts w:ascii="Calibri" w:hAnsi="Calibri"/>
           <w:color w:val="444444"/>
-          <w:sz w:val="20"/>
+          <w:sz w:val="19"/>
         </w:rPr>
-        <w:t>Пошаговая программа выхода из повторяющегося сценария выбора холодных партнеров и эмоциональных качелей.</w:t>
+        <w:t>Пошаговая программа выхода из повторяющегося сценария выбора холодных партнеров («эмоциональные качели»), интеграция тени и построение надежного союза (базовая цена — 5 000 ₽).</w:t>
       </w:r>
     </w:p>
     <w:p>
       <w:pPr>
-        <w:spacing w:before="280" w:after="80"/>
+        <w:spacing w:before="100" w:after="20"/>
+      </w:pPr>
+      <w:r>
+        <w:rPr>
+          <w:rFonts w:ascii="Calibri" w:hAnsi="Calibri"/>
+          <w:b/>
+          <w:color w:val="111111"/>
+          <w:sz w:val="21"/>
+        </w:rPr>
+        <w:t xml:space="preserve">• Курс «Точка опоры» (Сценарий 4: Острый кризис и измена) — </w:t>
+      </w:r>
+      <w:r>
+        <w:rPr>
+          <w:rFonts w:ascii="Calibri" w:hAnsi="Calibri"/>
+          <w:b/>
+          <w:color w:val="0E6E5D"/>
+          <w:sz w:val="22"/>
+        </w:rPr>
+        <w:t>2 400 ₽</w:t>
+      </w:r>
+      <w:r>
+        <w:rPr>
+          <w:rFonts w:ascii="Calibri" w:hAnsi="Calibri"/>
+          <w:i/>
+          <w:color w:val="666666"/>
+          <w:sz w:val="19"/>
+        </w:rPr>
+        <w:t xml:space="preserve"> (доступ 6 месяцев)</w:t>
+      </w:r>
+    </w:p>
+    <w:p>
+      <w:pPr>
+        <w:spacing w:after="80"/>
+        <w:ind w:left="360"/>
+      </w:pPr>
+      <w:r>
+        <w:rPr>
+          <w:rFonts w:ascii="Calibri" w:hAnsi="Calibri"/>
+          <w:color w:val="444444"/>
+          <w:sz w:val="19"/>
+        </w:rPr>
+        <w:t>Программа экстренной стабилизации и заземления при острых семейных штормах, изменах и угрозе развода (базовая цена — 5 000 ₽).</w:t>
+      </w:r>
+    </w:p>
+    <w:p>
+      <w:pPr>
+        <w:spacing w:before="100" w:after="20"/>
+      </w:pPr>
+      <w:r>
+        <w:rPr>
+          <w:rFonts w:ascii="Calibri" w:hAnsi="Calibri"/>
+          <w:b/>
+          <w:color w:val="111111"/>
+          <w:sz w:val="21"/>
+        </w:rPr>
+        <w:t xml:space="preserve">• Полный комплект «Все 4 курса линейки» (Семейная энциклопедия) — </w:t>
+      </w:r>
+      <w:r>
+        <w:rPr>
+          <w:rFonts w:ascii="Calibri" w:hAnsi="Calibri"/>
+          <w:b/>
+          <w:color w:val="0E6E5D"/>
+          <w:sz w:val="22"/>
+        </w:rPr>
+        <w:t>6 900 ₽</w:t>
+      </w:r>
+      <w:r>
+        <w:rPr>
+          <w:rFonts w:ascii="Calibri" w:hAnsi="Calibri"/>
+          <w:i/>
+          <w:color w:val="666666"/>
+          <w:sz w:val="19"/>
+        </w:rPr>
+        <w:t xml:space="preserve"> (доступ 12 месяцев)</w:t>
+      </w:r>
+    </w:p>
+    <w:p>
+      <w:pPr>
+        <w:spacing w:after="80"/>
+        <w:ind w:left="360"/>
+      </w:pPr>
+      <w:r>
+        <w:rPr>
+          <w:rFonts w:ascii="Calibri" w:hAnsi="Calibri"/>
+          <w:color w:val="444444"/>
+          <w:sz w:val="19"/>
+        </w:rPr>
+        <w:t>Полный доступ ко всем 4 курсам («Я выбираю», «Я остаюсь собой», «Мы вместе», «Точка опоры») со всеми бонусами и практиками.</w:t>
+      </w:r>
+    </w:p>
+    <w:p>
+      <w:pPr>
+        <w:spacing w:before="240" w:after="60"/>
       </w:pPr>
       <w:r>
         <w:rPr>
           <w:rFonts w:ascii="Calibri" w:hAnsi="Calibri"/>
           <w:b/>
           <w:color w:val="1F4E5B"/>
-          <w:sz w:val="26"/>
+          <w:sz w:val="24"/>
         </w:rPr>
-        <w:t>3. МЕДИТАЦИИ И АУДИОПРАКТИКИ</w:t>
+        <w:t>3. МЕДИТАЦИИ И АВТОРСКИЙ АУДИОФОНД</w:t>
       </w:r>
     </w:p>
     <w:p>
       <w:pPr>
-        <w:spacing w:before="120" w:after="20"/>
+        <w:spacing w:before="100" w:after="20"/>
       </w:pPr>
       <w:r>
         <w:rPr>
           <w:rFonts w:ascii="Calibri" w:hAnsi="Calibri"/>
           <w:b/>
           <w:color w:val="111111"/>
-          <w:sz w:val="22"/>
+          <w:sz w:val="21"/>
         </w:rPr>
         <w:t xml:space="preserve">• Аудиопрактика «Штиль в теле: сброс вечернего перегруза» — </w:t>
       </w:r>
@@ -370,7 +462,7 @@
           <w:rFonts w:ascii="Calibri" w:hAnsi="Calibri"/>
           <w:b/>
           <w:color w:val="0E6E5D"/>
-          <w:sz w:val="23"/>
+          <w:sz w:val="22"/>
         </w:rPr>
         <w:t>990 ₽</w:t>
       </w:r>
@@ -379,35 +471,35 @@
           <w:rFonts w:ascii="Calibri" w:hAnsi="Calibri"/>
           <w:i/>
           <w:color w:val="666666"/>
-          <w:sz w:val="20"/>
+          <w:sz w:val="19"/>
         </w:rPr>
-        <w:t xml:space="preserve"> (аудиофайл)</w:t>
+        <w:t xml:space="preserve"> (аудиофайл в личный кабинет)</w:t>
       </w:r>
     </w:p>
     <w:p>
       <w:pPr>
-        <w:spacing w:after="100"/>
+        <w:spacing w:after="80"/>
         <w:ind w:left="360"/>
       </w:pPr>
       <w:r>
         <w:rPr>
           <w:rFonts w:ascii="Calibri" w:hAnsi="Calibri"/>
           <w:color w:val="444444"/>
-          <w:sz w:val="20"/>
+          <w:sz w:val="19"/>
         </w:rPr>
-        <w:t>12-минутная соматическая аудиосессия на снятие мышечных зажимов с шеи и челюстей, снижение кортизола и восстановление сна.</w:t>
+        <w:t>12-минутная соматическая аудиосессия на снятие мышечных зажимов с шеи, диафрагмы и челюстей, снижение кортизола и восстановление сна.</w:t>
       </w:r>
     </w:p>
     <w:p>
       <w:pPr>
-        <w:spacing w:before="120" w:after="20"/>
+        <w:spacing w:before="100" w:after="20"/>
       </w:pPr>
       <w:r>
         <w:rPr>
           <w:rFonts w:ascii="Calibri" w:hAnsi="Calibri"/>
           <w:b/>
           <w:color w:val="111111"/>
-          <w:sz w:val="22"/>
+          <w:sz w:val="21"/>
         </w:rPr>
         <w:t xml:space="preserve">• Аудиопрактика «Амнистия обид: оставляем прошлое за порогом» — </w:t>
       </w:r>
@@ -416,7 +508,7 @@
           <w:rFonts w:ascii="Calibri" w:hAnsi="Calibri"/>
           <w:b/>
           <w:color w:val="0E6E5D"/>
-          <w:sz w:val="23"/>
+          <w:sz w:val="22"/>
         </w:rPr>
         <w:t>990 ₽</w:t>
       </w:r>
@@ -425,49 +517,141 @@
           <w:rFonts w:ascii="Calibri" w:hAnsi="Calibri"/>
           <w:i/>
           <w:color w:val="666666"/>
-          <w:sz w:val="20"/>
+          <w:sz w:val="19"/>
         </w:rPr>
-        <w:t xml:space="preserve"> (аудиофайл)</w:t>
+        <w:t xml:space="preserve"> (аудиофайл в личный кабинет)</w:t>
       </w:r>
     </w:p>
     <w:p>
       <w:pPr>
-        <w:spacing w:after="100"/>
+        <w:spacing w:after="80"/>
         <w:ind w:left="360"/>
       </w:pPr>
       <w:r>
         <w:rPr>
           <w:rFonts w:ascii="Calibri" w:hAnsi="Calibri"/>
           <w:color w:val="444444"/>
-          <w:sz w:val="20"/>
+          <w:sz w:val="19"/>
         </w:rPr>
-        <w:t>11-минутная сессия на освобождение от груза прошлых обид и претензий к партнеру.</w:t>
+        <w:t>11-минутная гипнотическая сессия на освобождение от накопившегося груза прошлых обид и претензий к партнеру.</w:t>
       </w:r>
     </w:p>
     <w:p>
       <w:pPr>
-        <w:spacing w:before="280" w:after="80"/>
+        <w:spacing w:before="100" w:after="20"/>
+      </w:pPr>
+      <w:r>
+        <w:rPr>
+          <w:rFonts w:ascii="Calibri" w:hAnsi="Calibri"/>
+          <w:b/>
+          <w:color w:val="111111"/>
+          <w:sz w:val="21"/>
+        </w:rPr>
+        <w:t xml:space="preserve">• Аудиопрактика «Союз двух свободных: устойчивость и тепло» — </w:t>
+      </w:r>
+      <w:r>
+        <w:rPr>
+          <w:rFonts w:ascii="Calibri" w:hAnsi="Calibri"/>
+          <w:b/>
+          <w:color w:val="0E6E5D"/>
+          <w:sz w:val="22"/>
+        </w:rPr>
+        <w:t>990 ₽</w:t>
+      </w:r>
+      <w:r>
+        <w:rPr>
+          <w:rFonts w:ascii="Calibri" w:hAnsi="Calibri"/>
+          <w:i/>
+          <w:color w:val="666666"/>
+          <w:sz w:val="19"/>
+        </w:rPr>
+        <w:t xml:space="preserve"> (аудиофайл в личный кабинет)</w:t>
+      </w:r>
+    </w:p>
+    <w:p>
+      <w:pPr>
+        <w:spacing w:after="80"/>
+        <w:ind w:left="360"/>
+      </w:pPr>
+      <w:r>
+        <w:rPr>
+          <w:rFonts w:ascii="Calibri" w:hAnsi="Calibri"/>
+          <w:color w:val="444444"/>
+          <w:sz w:val="19"/>
+        </w:rPr>
+        <w:t>12-минутная сессия закрепления автономии, личных границ и партнерского тепла.</w:t>
+      </w:r>
+    </w:p>
+    <w:p>
+      <w:pPr>
+        <w:spacing w:before="100" w:after="20"/>
+      </w:pPr>
+      <w:r>
+        <w:rPr>
+          <w:rFonts w:ascii="Calibri" w:hAnsi="Calibri"/>
+          <w:b/>
+          <w:color w:val="111111"/>
+          <w:sz w:val="21"/>
+        </w:rPr>
+        <w:t xml:space="preserve">• Сборник из 5 авторских аудиопрактик Анатолия Фёдорова — </w:t>
+      </w:r>
+      <w:r>
+        <w:rPr>
+          <w:rFonts w:ascii="Calibri" w:hAnsi="Calibri"/>
+          <w:b/>
+          <w:color w:val="0E6E5D"/>
+          <w:sz w:val="22"/>
+        </w:rPr>
+        <w:t>2 900 ₽</w:t>
+      </w:r>
+      <w:r>
+        <w:rPr>
+          <w:rFonts w:ascii="Calibri" w:hAnsi="Calibri"/>
+          <w:i/>
+          <w:color w:val="666666"/>
+          <w:sz w:val="19"/>
+        </w:rPr>
+        <w:t xml:space="preserve"> (бессрочный доступ)</w:t>
+      </w:r>
+    </w:p>
+    <w:p>
+      <w:pPr>
+        <w:spacing w:after="80"/>
+        <w:ind w:left="360"/>
+      </w:pPr>
+      <w:r>
+        <w:rPr>
+          <w:rFonts w:ascii="Calibri" w:hAnsi="Calibri"/>
+          <w:color w:val="444444"/>
+          <w:sz w:val="19"/>
+        </w:rPr>
+        <w:t>Полный цикл соматических и гипнотерапевтических аудиосессий для ежедневной саморегуляции.</w:t>
+      </w:r>
+    </w:p>
+    <w:p>
+      <w:pPr>
+        <w:spacing w:before="240" w:after="60"/>
       </w:pPr>
       <w:r>
         <w:rPr>
           <w:rFonts w:ascii="Calibri" w:hAnsi="Calibri"/>
           <w:b/>
           <w:color w:val="1F4E5B"/>
-          <w:sz w:val="26"/>
+          <w:sz w:val="24"/>
         </w:rPr>
-        <w:t>4. ИНДИВИДУАЛЬНАЯ РАБОТА И КОНСУЛЬТАЦИИ</w:t>
+        <w:t>4. ИНДИВИДУАЛЬНАЯ РАБОТА И КОНСУЛЬТАЦИИ С АНАТОЛИЕМ ФЁДОРОВЫМ</w:t>
       </w:r>
     </w:p>
     <w:p>
       <w:pPr>
-        <w:spacing w:before="120" w:after="20"/>
+        <w:spacing w:before="100" w:after="20"/>
       </w:pPr>
       <w:r>
         <w:rPr>
           <w:rFonts w:ascii="Calibri" w:hAnsi="Calibri"/>
           <w:b/>
           <w:color w:val="111111"/>
-          <w:sz w:val="22"/>
+          <w:sz w:val="21"/>
         </w:rPr>
         <w:t xml:space="preserve">• Индивидуальная психологическая сессия / Диагностика — </w:t>
       </w:r>
@@ -476,7 +660,7 @@
           <w:rFonts w:ascii="Calibri" w:hAnsi="Calibri"/>
           <w:b/>
           <w:color w:val="0E6E5D"/>
-          <w:sz w:val="23"/>
+          <w:sz w:val="22"/>
         </w:rPr>
         <w:t>10 000 ₽</w:t>
       </w:r>
@@ -485,44 +669,90 @@
           <w:rFonts w:ascii="Calibri" w:hAnsi="Calibri"/>
           <w:i/>
           <w:color w:val="666666"/>
-          <w:sz w:val="20"/>
+          <w:sz w:val="19"/>
         </w:rPr>
         <w:t xml:space="preserve"> (онлайн, 60–80 минут)</w:t>
       </w:r>
     </w:p>
     <w:p>
       <w:pPr>
-        <w:spacing w:after="100"/>
+        <w:spacing w:after="80"/>
         <w:ind w:left="360"/>
       </w:pPr>
       <w:r>
         <w:rPr>
           <w:rFonts w:ascii="Calibri" w:hAnsi="Calibri"/>
           <w:color w:val="444444"/>
-          <w:sz w:val="20"/>
+          <w:sz w:val="19"/>
         </w:rPr>
-        <w:t>Глубокий разбор ситуации, определение системного корня проблемы, гипнотерапевтическая коррекция и персональный план решений с Анатолием Фёдоровым.</w:t>
+        <w:t>Глубокий разбор ситуации, определение системного корня проблемы (в отношениях, личном состоянии или сценарии жизни), гипнотерапевтическая коррекция и составление персонального пошагового плана решений.</w:t>
       </w:r>
     </w:p>
     <w:p>
       <w:pPr>
-        <w:spacing w:before="120" w:after="20"/>
+        <w:spacing w:before="100" w:after="20"/>
       </w:pPr>
       <w:r>
         <w:rPr>
           <w:rFonts w:ascii="Calibri" w:hAnsi="Calibri"/>
           <w:b/>
           <w:color w:val="111111"/>
-          <w:sz w:val="22"/>
+          <w:sz w:val="21"/>
         </w:rPr>
-        <w:t xml:space="preserve">• Пакет из 3-х индивидуальных сессий — </w:t>
+        <w:t xml:space="preserve">• Парная консультация (Супружеская сессия) — </w:t>
       </w:r>
       <w:r>
         <w:rPr>
           <w:rFonts w:ascii="Calibri" w:hAnsi="Calibri"/>
           <w:b/>
           <w:color w:val="0E6E5D"/>
-          <w:sz w:val="23"/>
+          <w:sz w:val="22"/>
+        </w:rPr>
+        <w:t>15 000 ₽</w:t>
+      </w:r>
+      <w:r>
+        <w:rPr>
+          <w:rFonts w:ascii="Calibri" w:hAnsi="Calibri"/>
+          <w:i/>
+          <w:color w:val="666666"/>
+          <w:sz w:val="19"/>
+        </w:rPr>
+        <w:t xml:space="preserve"> (онлайн, 90 минут)</w:t>
+      </w:r>
+    </w:p>
+    <w:p>
+      <w:pPr>
+        <w:spacing w:after="80"/>
+        <w:ind w:left="360"/>
+      </w:pPr>
+      <w:r>
+        <w:rPr>
+          <w:rFonts w:ascii="Calibri" w:hAnsi="Calibri"/>
+          <w:color w:val="444444"/>
+          <w:sz w:val="19"/>
+        </w:rPr>
+        <w:t>Совместная онлайн-сессия для пары по снятию бытовой глухоты, остановке многолетних конфликтов и выработке новых правил совместной жизни.</w:t>
+      </w:r>
+    </w:p>
+    <w:p>
+      <w:pPr>
+        <w:spacing w:before="100" w:after="20"/>
+      </w:pPr>
+      <w:r>
+        <w:rPr>
+          <w:rFonts w:ascii="Calibri" w:hAnsi="Calibri"/>
+          <w:b/>
+          <w:color w:val="111111"/>
+          <w:sz w:val="21"/>
+        </w:rPr>
+        <w:t xml:space="preserve">• Пакет из 3-х индивидуальных сессий (Комплексная трансформация) — </w:t>
+      </w:r>
+      <w:r>
+        <w:rPr>
+          <w:rFonts w:ascii="Calibri" w:hAnsi="Calibri"/>
+          <w:b/>
+          <w:color w:val="0E6E5D"/>
+          <w:sz w:val="22"/>
         </w:rPr>
         <w:t>27 000 ₽</w:t>
       </w:r>
@@ -531,50 +761,206 @@
           <w:rFonts w:ascii="Calibri" w:hAnsi="Calibri"/>
           <w:i/>
           <w:color w:val="666666"/>
-          <w:sz w:val="20"/>
+          <w:sz w:val="19"/>
         </w:rPr>
         <w:t xml:space="preserve"> (онлайн, 3 сессии)</w:t>
       </w:r>
     </w:p>
     <w:p>
       <w:pPr>
-        <w:spacing w:after="100"/>
+        <w:spacing w:after="80"/>
         <w:ind w:left="360"/>
       </w:pPr>
       <w:r>
         <w:rPr>
           <w:rFonts w:ascii="Calibri" w:hAnsi="Calibri"/>
           <w:color w:val="444444"/>
-          <w:sz w:val="20"/>
+          <w:sz w:val="19"/>
         </w:rPr>
-        <w:t>Полный цикл глубокой проработки запроса: диагностика ➔ гипнотерапия и перепрошивка сценария ➔ закрепление новых реакций и защита от откатов.</w:t>
+        <w:t>Полный цикл глубокой проработки запроса: диагностика ➔ гипнотерапия и перепрошивка сценария ➔ закрепление новых поведенческих реакций и защита от откатов.</w:t>
       </w:r>
     </w:p>
     <w:p>
       <w:pPr>
-        <w:spacing w:before="320"/>
+        <w:spacing w:before="100" w:after="20"/>
+      </w:pPr>
+      <w:r>
+        <w:rPr>
+          <w:rFonts w:ascii="Calibri" w:hAnsi="Calibri"/>
+          <w:b/>
+          <w:color w:val="111111"/>
+          <w:sz w:val="21"/>
+        </w:rPr>
+        <w:t xml:space="preserve">• Месячное персональное ведение и наставничество — </w:t>
+      </w:r>
+      <w:r>
+        <w:rPr>
+          <w:rFonts w:ascii="Calibri" w:hAnsi="Calibri"/>
+          <w:b/>
+          <w:color w:val="0E6E5D"/>
+          <w:sz w:val="22"/>
+        </w:rPr>
+        <w:t>50 000 ₽</w:t>
+      </w:r>
+      <w:r>
+        <w:rPr>
+          <w:rFonts w:ascii="Calibri" w:hAnsi="Calibri"/>
+          <w:i/>
+          <w:color w:val="666666"/>
+          <w:sz w:val="19"/>
+        </w:rPr>
+        <w:t xml:space="preserve"> (1 месяц)</w:t>
+      </w:r>
+    </w:p>
+    <w:p>
+      <w:pPr>
+        <w:spacing w:after="80"/>
+        <w:ind w:left="360"/>
+      </w:pPr>
+      <w:r>
+        <w:rPr>
+          <w:rFonts w:ascii="Calibri" w:hAnsi="Calibri"/>
+          <w:color w:val="444444"/>
+          <w:sz w:val="19"/>
+        </w:rPr>
+        <w:t>4 индивидуальные сессии + персональное аудиосопровождение и поддержка в Telegram между сессиями.</w:t>
+      </w:r>
+    </w:p>
+    <w:p>
+      <w:pPr>
+        <w:spacing w:before="240" w:after="60"/>
       </w:pPr>
       <w:r>
         <w:rPr>
           <w:rFonts w:ascii="Calibri" w:hAnsi="Calibri"/>
           <w:b/>
           <w:color w:val="1F4E5B"/>
-          <w:sz w:val="20"/>
+          <w:sz w:val="24"/>
         </w:rPr>
-        <w:t>ПРИМЕЧАНИЕ К ПРАЙС-ЛИСТУ:</w:t>
+        <w:t>5. ВЕБИНАРЫ И ТЕМАТИЧЕСКИЕ СЕМИНАРЫ</w:t>
+      </w:r>
+    </w:p>
+    <w:p>
+      <w:pPr>
+        <w:spacing w:before="100" w:after="20"/>
+      </w:pPr>
+      <w:r>
+        <w:rPr>
+          <w:rFonts w:ascii="Calibri" w:hAnsi="Calibri"/>
+          <w:b/>
+          <w:color w:val="111111"/>
+          <w:sz w:val="21"/>
+        </w:rPr>
+        <w:t xml:space="preserve">• Участие в тематическом онлайн-семинаре (например, «Деньги и сценарии рода») — </w:t>
+      </w:r>
+      <w:r>
+        <w:rPr>
+          <w:rFonts w:ascii="Calibri" w:hAnsi="Calibri"/>
+          <w:b/>
+          <w:color w:val="0E6E5D"/>
+          <w:sz w:val="22"/>
+        </w:rPr>
+        <w:t>1 500 ₽</w:t>
+      </w:r>
+      <w:r>
+        <w:rPr>
+          <w:rFonts w:ascii="Calibri" w:hAnsi="Calibri"/>
+          <w:i/>
+          <w:color w:val="666666"/>
+          <w:sz w:val="19"/>
+        </w:rPr>
+        <w:t xml:space="preserve"> (онлайн-эфир + запись)</w:t>
+      </w:r>
+    </w:p>
+    <w:p>
+      <w:pPr>
+        <w:spacing w:after="80"/>
+        <w:ind w:left="360"/>
+      </w:pPr>
+      <w:r>
+        <w:rPr>
+          <w:rFonts w:ascii="Calibri" w:hAnsi="Calibri"/>
+          <w:color w:val="444444"/>
+          <w:sz w:val="19"/>
+        </w:rPr>
+        <w:t>Живое участие в 2-часовом онлайн-семинаре с разбором кейсов + бессрочный доступ к видеозаписи и методическим материалам.</w:t>
+      </w:r>
+    </w:p>
+    <w:p>
+      <w:pPr>
+        <w:spacing w:before="100" w:after="20"/>
+      </w:pPr>
+      <w:r>
+        <w:rPr>
+          <w:rFonts w:ascii="Calibri" w:hAnsi="Calibri"/>
+          <w:b/>
+          <w:color w:val="111111"/>
+          <w:sz w:val="21"/>
+        </w:rPr>
+        <w:t xml:space="preserve">• Запись любого прошедшего мастер-класса / вебинара — </w:t>
+      </w:r>
+      <w:r>
+        <w:rPr>
+          <w:rFonts w:ascii="Calibri" w:hAnsi="Calibri"/>
+          <w:b/>
+          <w:color w:val="0E6E5D"/>
+          <w:sz w:val="22"/>
+        </w:rPr>
+        <w:t>990 ₽</w:t>
+      </w:r>
+      <w:r>
+        <w:rPr>
+          <w:rFonts w:ascii="Calibri" w:hAnsi="Calibri"/>
+          <w:i/>
+          <w:color w:val="666666"/>
+          <w:sz w:val="19"/>
+        </w:rPr>
+        <w:t xml:space="preserve"> (доступ в личном кабинете)</w:t>
+      </w:r>
+    </w:p>
+    <w:p>
+      <w:pPr>
+        <w:spacing w:after="80"/>
+        <w:ind w:left="360"/>
+      </w:pPr>
+      <w:r>
+        <w:rPr>
+          <w:rFonts w:ascii="Calibri" w:hAnsi="Calibri"/>
+          <w:color w:val="444444"/>
+          <w:sz w:val="19"/>
+        </w:rPr>
+        <w:t>Доступ к полной видеозаписи и практическим упражнениям прошедших эфиров.</w:t>
+      </w:r>
+    </w:p>
+    <w:p>
+      <w:pPr>
+        <w:spacing w:before="280"/>
+      </w:pPr>
+      <w:r>
+        <w:rPr>
+          <w:rFonts w:ascii="Calibri" w:hAnsi="Calibri"/>
+          <w:b/>
+          <w:color w:val="1F4E5B"/>
+          <w:sz w:val="19"/>
+        </w:rPr>
+        <w:t>ПРИМЕЧАНИЯ И УСЛОВИЯ ОПЛАТЫ:</w:t>
         <w:br/>
       </w:r>
       <w:r>
         <w:rPr>
           <w:rFonts w:ascii="Calibri" w:hAnsi="Calibri"/>
           <w:color w:val="555555"/>
-          <w:sz w:val="19"/>
+          <w:sz w:val="18"/>
         </w:rPr>
-        <w:t>1. Все цены указаны в российских рублях. НДС не облагается в связи с применением специального налогового режима НПД (самозанятый, Федеральный закон № 422-ФЗ).</w:t>
+        <w:t>1. Все цены указаны в российских рублях. НДС не облагается в связи с применением Исполнителем специального налогового режима «Налог на профессиональный доход» (самозанятый, Федеральный закон от 27.11.2018 № 422-ФЗ).</w:t>
         <w:br/>
-        <w:t>2. Оплата производится на условиях 100% предоплаты в безналичном порядке через уполномоченные платежные сервисы (Robokassa и др.).</w:t>
+        <w:t>2. Оплата производится на условиях 100% предоплаты через уполномоченные платежные сервисы (Robokassa, СБП и др.).</w:t>
         <w:br/>
-        <w:t>3. Услуги профессионального образования в Академии МАГиГ оформляются отдельными договорами через Академию.</w:t>
+        <w:t>3. Моментом оказания услуг по цифровым отчетам и курсам является момент предоставления доступа к файлам/материалам.</w:t>
+        <w:br/>
+        <w:t>4. Перенос индивидуальных консультаций допускается не позднее чем за 24 часа до назначенного времени.</w:t>
+        <w:br/>
+        <w:t>5. Обучение в Академии МАГиГ регулируется отдельными договорами.</w:t>
       </w:r>
     </w:p>
     <w:sectPr>

</xml_diff>

<commit_message>
legal: final cross-audit verified 100% data integrity across all 6 legal documents
</commit_message>
<xml_diff>
--- a/baza/исходник миникурса/ПРАЙС_ЛИСТ_УСЛУГ_И_ПРОДУКТОВ_ФЕДОРОВ.docx
+++ b/baza/исходник миникурса/ПРАЙС_ЛИСТ_УСЛУГ_И_ПРОДУКТОВ_ФЕДОРОВ.docx
@@ -963,6 +963,11 @@
         <w:t>5. Обучение в Академии МАГиГ регулируется отдельными договорами.</w:t>
       </w:r>
     </w:p>
+    <w:p>
+      <w:r>
+        <w:t>Контакты для консультаций и оплаты: e-mail: tolikus@inbox.ru | Telegram: https://t.me/luck_master</w:t>
+      </w:r>
+    </w:p>
     <w:sectPr>
       <w:pgSz w:w="12240" w:h="15840"/>
       <w:pgMar w:top="1440" w:right="1440" w:bottom="1440" w:left="1440" w:header="720" w:footer="720" w:gutter="0"/>

</xml_diff>